<commit_message>
docs: plain language review complete for chapter 4
</commit_message>
<xml_diff>
--- a/docs/thesis-chapter-4.docx
+++ b/docs/thesis-chapter-4.docx
@@ -260,7 +260,7 @@
           </w:tcPr>
           <w:p>
             <w:r>
-              <w:t>Authenticate users and issue a JSON Web Token (JWT) for protected access.</w:t>
+              <w:t>Authenticate users and issue a JSON Web Token (JWT) — a compact security credential — for protected access.</w:t>
             </w:r>
           </w:p>
         </w:tc>
@@ -312,7 +312,7 @@
           </w:tcPr>
           <w:p>
             <w:r>
-              <w:t>Refresh authenticated sessions through a protected endpoint.</w:t>
+              <w:t>Extend an authenticated session by issuing a refreshed security token.</w:t>
             </w:r>
           </w:p>
         </w:tc>
@@ -936,7 +936,7 @@
           </w:tcPr>
           <w:p>
             <w:r>
-              <w:t>Stream document content for in-application preview.</w:t>
+              <w:t>Allow users to view the original document directly in the browser without downloading it.</w:t>
             </w:r>
           </w:p>
         </w:tc>
@@ -1092,7 +1092,7 @@
           </w:tcPr>
           <w:p>
             <w:r>
-              <w:t>Re-embed document content and regenerate vectors.</w:t>
+              <w:t>Re-process a document by re-indexing its content and updating the stored search representations.</w:t>
             </w:r>
           </w:p>
         </w:tc>
@@ -1144,7 +1144,7 @@
           </w:tcPr>
           <w:p>
             <w:r>
-              <w:t>Delete the document record, stored file, and vectors.</w:t>
+              <w:t>Delete the document record, stored file, and all associated search index data.</w:t>
             </w:r>
           </w:p>
         </w:tc>
@@ -1699,18 +1699,8 @@
             <w:tcW w:type="dxa" w:w="2929"/>
           </w:tcPr>
           <w:p>
-            <w:pPr>
-              <w:spacing w:line="360" w:lineRule="exact" w:before="0" w:after="0"/>
-              <w:jc w:val="left"/>
-            </w:pPr>
             <w:r>
-              <w:rPr>
-                <w:rFonts w:ascii="Times New Roman" w:hAnsi="Times New Roman"/>
-                <w:b w:val="0"/>
-                <w:i w:val="0"/>
-                <w:sz w:val="24"/>
-              </w:rPr>
-              <w:t>All protected endpoints require JWT-based authentication and role checks.</w:t>
+              <w:t>All protected features require a valid JWT (security token) and role verification.</w:t>
             </w:r>
           </w:p>
         </w:tc>
@@ -1884,18 +1874,8 @@
             <w:tcW w:type="dxa" w:w="2929"/>
           </w:tcPr>
           <w:p>
-            <w:pPr>
-              <w:spacing w:line="360" w:lineRule="exact" w:before="0" w:after="0"/>
-              <w:jc w:val="left"/>
-            </w:pPr>
             <w:r>
-              <w:rPr>
-                <w:rFonts w:ascii="Times New Roman" w:hAnsi="Times New Roman"/>
-                <w:b w:val="0"/>
-                <w:i w:val="0"/>
-                <w:sz w:val="24"/>
-              </w:rPr>
-              <w:t>Semantic retrieval must return relevant chunks without blocking the API thread.</w:t>
+              <w:t>AI-powered search must return results without blocking other user interactions.</w:t>
             </w:r>
           </w:p>
         </w:tc>
@@ -2008,18 +1988,8 @@
             <w:tcW w:type="dxa" w:w="2929"/>
           </w:tcPr>
           <w:p>
-            <w:pPr>
-              <w:spacing w:line="360" w:lineRule="exact" w:before="0" w:after="0"/>
-              <w:jc w:val="left"/>
-            </w:pPr>
             <w:r>
-              <w:rPr>
-                <w:rFonts w:ascii="Times New Roman" w:hAnsi="Times New Roman"/>
-                <w:b w:val="0"/>
-                <w:i w:val="0"/>
-                <w:sz w:val="24"/>
-              </w:rPr>
-              <w:t>ChromaDB connectivity retries must be non-blocking to avoid startup failures.</w:t>
+              <w:t>The connection to the search database must retry automatically in the background without delaying server startup.</w:t>
             </w:r>
           </w:p>
         </w:tc>
@@ -2070,18 +2040,8 @@
             <w:tcW w:type="dxa" w:w="2929"/>
           </w:tcPr>
           <w:p>
-            <w:pPr>
-              <w:spacing w:line="360" w:lineRule="exact" w:before="0" w:after="0"/>
-              <w:jc w:val="left"/>
-            </w:pPr>
             <w:r>
-              <w:rPr>
-                <w:rFonts w:ascii="Times New Roman" w:hAnsi="Times New Roman"/>
-                <w:b w:val="0"/>
-                <w:i w:val="0"/>
-                <w:sz w:val="24"/>
-              </w:rPr>
-              <w:t>Stateless API routes allow horizontal scaling of the backend service.</w:t>
+              <w:t>The API is designed so that multiple server instances can run in parallel to handle increased load.</w:t>
             </w:r>
           </w:p>
         </w:tc>
@@ -2194,18 +2154,8 @@
             <w:tcW w:type="dxa" w:w="2929"/>
           </w:tcPr>
           <w:p>
-            <w:pPr>
-              <w:spacing w:line="360" w:lineRule="exact" w:before="0" w:after="0"/>
-              <w:jc w:val="left"/>
-            </w:pPr>
             <w:r>
-              <w:rPr>
-                <w:rFonts w:ascii="Times New Roman" w:hAnsi="Times New Roman"/>
-                <w:b w:val="0"/>
-                <w:i w:val="0"/>
-                <w:sz w:val="24"/>
-              </w:rPr>
-              <w:t>Business logic is encapsulated in services to reduce controller complexity.</w:t>
+              <w:t>Business logic is kept separate from request handling to reduce complexity and improve maintainability.</w:t>
             </w:r>
           </w:p>
         </w:tc>
@@ -2643,7 +2593,7 @@
                 <w:i w:val="0"/>
                 <w:sz w:val="24"/>
               </w:rPr>
-              <w:t>JWT not issued at this step</w:t>
+              <w:t>No security token issued at this step</w:t>
             </w:r>
           </w:p>
         </w:tc>
@@ -2794,7 +2744,7 @@
           <w:i w:val="0"/>
           <w:sz w:val="24"/>
         </w:rPr>
-        <w:t xml:space="preserve"> A guest authenticates with valid credentials to obtain a JWT for protected access.</w:t>
+        <w:t xml:space="preserve"> A guest authenticates with valid credentials to obtain a security token for protected access.</w:t>
       </w:r>
     </w:p>
     <w:p>
@@ -5600,7 +5550,7 @@
           <w:i w:val="0"/>
           <w:sz w:val="24"/>
         </w:rPr>
-        <w:t xml:space="preserve"> The document and its vectors are removed, or the system reports a deletion failure.</w:t>
+        <w:t xml:space="preserve"> The document and its vectors are removed.</w:t>
       </w:r>
     </w:p>
     <w:p>
@@ -7591,7 +7541,7 @@
           <w:i w:val="0"/>
           <w:sz w:val="24"/>
         </w:rPr>
-        <w:t xml:space="preserve"> A join request exists with pending status for admin review.</w:t>
+        <w:t xml:space="preserve"> A join request exists with pending status and is queued for administrator review.</w:t>
       </w:r>
     </w:p>
     <w:p>
@@ -8641,7 +8591,7 @@
           <w:i w:val="0"/>
           <w:sz w:val="24"/>
         </w:rPr>
-        <w:t xml:space="preserve"> The user profile is updated and a new JWT is issued if changes are valid.</w:t>
+        <w:t xml:space="preserve"> The user profile is updated and a refreshed security token is issued if changes are valid.</w:t>
       </w:r>
     </w:p>
     <w:p>

</xml_diff>